<commit_message>
Strip placeholder yellow highlights from Värdeutlåtande output
The mall.docx template marked every placeholder with a yellow highlight
as an authoring aid. python-docx writes the substituted text into the
paragraph's first run and preserves its formatting, so any field whose
first run carried the highlight rendered yellow in the populated docx.
The signing-date line (`[Ort],[Datum]`) was the only paragraph whose
first run was highlighted, which matches the operator's report.

Belt-and-suspenders: strip the highlights from every run in the bundled
template so future code paths inherit clean formatting, and strip the
highlight from the lead run after substitution in the populator so any
future hand-off template that ships placeholder highlights still renders
clean output.
</commit_message>
<xml_diff>
--- a/app/valuation_statement/templates/vardeutlatande_mall.docx
+++ b/app/valuation_statement/templates/vardeutlatande_mall.docx
@@ -101,23 +101,17 @@
         <w:t>Objekt:</w:t>
       </w:r>
       <w:r>
-        <w:rPr>
-          <w:highlight w:val="yellow"/>
-        </w:rPr>
+        <w:rPr/>
         <w:t xml:space="preserve"> [Kommun Fastighet 1:1] [Lägenhetsnummer, BRF namn och </w:t>
       </w:r>
       <w:proofErr w:type="spellStart"/>
       <w:r>
-        <w:rPr>
-          <w:highlight w:val="yellow"/>
-        </w:rPr>
+        <w:rPr/>
         <w:t>orgnr</w:t>
       </w:r>
       <w:proofErr w:type="spellEnd"/>
       <w:r>
-        <w:rPr>
-          <w:highlight w:val="yellow"/>
-        </w:rPr>
+        <w:rPr/>
         <w:t>]</w:t>
       </w:r>
     </w:p>
@@ -140,21 +134,15 @@
         <w:t xml:space="preserve"> </w:t>
       </w:r>
       <w:r>
-        <w:rPr>
-          <w:highlight w:val="yellow"/>
-        </w:rPr>
+        <w:rPr/>
         <w:t xml:space="preserve">[Gatuadress, </w:t>
       </w:r>
       <w:r>
-        <w:rPr>
-          <w:highlight w:val="yellow"/>
-        </w:rPr>
+        <w:rPr/>
         <w:t>postort]</w:t>
       </w:r>
       <w:r>
-        <w:rPr>
-          <w:highlight w:val="yellow"/>
-        </w:rPr>
+        <w:rPr/>
         <w:t xml:space="preserve"> [Enbart bostadsrätt]</w:t>
       </w:r>
     </w:p>
@@ -177,15 +165,11 @@
         <w:t xml:space="preserve"> </w:t>
       </w:r>
       <w:r>
-        <w:rPr>
-          <w:highlight w:val="yellow"/>
-        </w:rPr>
+        <w:rPr/>
         <w:t>[Kommun]</w:t>
       </w:r>
       <w:r>
-        <w:rPr>
-          <w:highlight w:val="yellow"/>
-        </w:rPr>
+        <w:rPr/>
         <w:t xml:space="preserve"> [Enbart bostadsrätt]</w:t>
       </w:r>
     </w:p>
@@ -208,9 +192,7 @@
         <w:t xml:space="preserve"> </w:t>
       </w:r>
       <w:r>
-        <w:rPr>
-          <w:highlight w:val="yellow"/>
-        </w:rPr>
+        <w:rPr/>
         <w:t>[Friköpt / Tomträtt / Bostadsrätt]</w:t>
       </w:r>
     </w:p>
@@ -236,53 +218,39 @@
         <w:t xml:space="preserve"> </w:t>
       </w:r>
       <w:r>
-        <w:rPr>
-          <w:highlight w:val="yellow"/>
-        </w:rPr>
+        <w:rPr/>
         <w:t xml:space="preserve">per datum </w:t>
       </w:r>
       <w:proofErr w:type="spellStart"/>
       <w:r>
-        <w:rPr>
-          <w:highlight w:val="yellow"/>
-        </w:rPr>
+        <w:rPr/>
         <w:t>xxxx-xx-xx</w:t>
       </w:r>
       <w:proofErr w:type="spellEnd"/>
       <w:r>
-        <w:rPr>
-          <w:highlight w:val="yellow"/>
-        </w:rPr>
+        <w:rPr/>
         <w:t>,</w:t>
       </w:r>
       <w:r>
         <w:t xml:space="preserve"> fastighetsutdrag </w:t>
       </w:r>
       <w:r>
-        <w:rPr>
-          <w:highlight w:val="yellow"/>
-        </w:rPr>
+        <w:rPr/>
         <w:t xml:space="preserve">per datum </w:t>
       </w:r>
       <w:proofErr w:type="spellStart"/>
       <w:r>
-        <w:rPr>
-          <w:highlight w:val="yellow"/>
-        </w:rPr>
+        <w:rPr/>
         <w:t>xxxx-xx-</w:t>
       </w:r>
       <w:proofErr w:type="gramStart"/>
       <w:r>
-        <w:rPr>
-          <w:highlight w:val="yellow"/>
-        </w:rPr>
+        <w:rPr/>
         <w:t>xx</w:t>
       </w:r>
       <w:proofErr w:type="spellEnd"/>
       <w:r>
-        <w:rPr>
-          <w:highlight w:val="yellow"/>
-        </w:rPr>
+        <w:rPr/>
         <w:t>,</w:t>
       </w:r>
       <w:r>
@@ -299,16 +267,12 @@
         <w:t xml:space="preserve"> </w:t>
       </w:r>
       <w:r>
-        <w:rPr>
-          <w:highlight w:val="yellow"/>
-        </w:rPr>
+        <w:rPr/>
         <w:t xml:space="preserve">per datum </w:t>
       </w:r>
       <w:proofErr w:type="spellStart"/>
       <w:r>
-        <w:rPr>
-          <w:highlight w:val="yellow"/>
-        </w:rPr>
+        <w:rPr/>
         <w:t>xxxx-xx-xx</w:t>
       </w:r>
       <w:proofErr w:type="spellEnd"/>
@@ -325,15 +289,11 @@
         <w:t xml:space="preserve">g. </w:t>
       </w:r>
       <w:r>
-        <w:rPr>
-          <w:highlight w:val="yellow"/>
-        </w:rPr>
+        <w:rPr/>
         <w:t xml:space="preserve"> [Fyll på ifall bilder har inhämtats och bedömning ifall det föreligger renoveringsbehov eller</w:t>
       </w:r>
       <w:r>
-        <w:rPr>
-          <w:highlight w:val="yellow"/>
-        </w:rPr>
+        <w:rPr/>
         <w:t xml:space="preserve"> annat].</w:t>
       </w:r>
     </w:p>
@@ -369,18 +329,14 @@
         <w:t xml:space="preserve">Vid värdering av </w:t>
       </w:r>
       <w:r>
-        <w:rPr>
-          <w:highlight w:val="yellow"/>
-        </w:rPr>
+        <w:rPr/>
         <w:t>[objekt]</w:t>
       </w:r>
       <w:r>
         <w:t xml:space="preserve"> i </w:t>
       </w:r>
       <w:r>
-        <w:rPr>
-          <w:highlight w:val="yellow"/>
-        </w:rPr>
+        <w:rPr/>
         <w:t>[Kommun]</w:t>
       </w:r>
       <w:r>
@@ -411,32 +367,24 @@
         <w:t xml:space="preserve"> storlek, läge, standard och skick. Nyckeltal såsom genomsnittspris, pris per kvm och K/T värde används som stöd i bedömningen, tillsammans med värderarens erfarenhet och kunskap om den lokala marknaden. Marknadsförhållandena och likviditeten bedöms som </w:t>
       </w:r>
       <w:r>
-        <w:rPr>
-          <w:highlight w:val="yellow"/>
-        </w:rPr>
+        <w:rPr/>
         <w:t>[god/normal/låg].</w:t>
       </w:r>
       <w:r>
         <w:t xml:space="preserve"> </w:t>
       </w:r>
       <w:r>
-        <w:rPr>
-          <w:highlight w:val="yellow"/>
-        </w:rPr>
+        <w:rPr/>
         <w:t xml:space="preserve">Vid låg likviditet behöver vi en förklaring, </w:t>
       </w:r>
       <w:proofErr w:type="gramStart"/>
       <w:r>
-        <w:rPr>
-          <w:highlight w:val="yellow"/>
-        </w:rPr>
+        <w:rPr/>
         <w:t>t.ex.</w:t>
       </w:r>
       <w:proofErr w:type="gramEnd"/>
       <w:r>
-        <w:rPr>
-          <w:highlight w:val="yellow"/>
-        </w:rPr>
+        <w:rPr/>
         <w:t xml:space="preserve"> sålda objekt senaste 3/12 månader.</w:t>
       </w:r>
       <w:r>
@@ -450,18 +398,14 @@
         <w:t xml:space="preserve">Marknadsvärdet bedöms till </w:t>
       </w:r>
       <w:r>
-        <w:rPr>
-          <w:highlight w:val="yellow"/>
-        </w:rPr>
+        <w:rPr/>
         <w:t xml:space="preserve">[belopp] </w:t>
       </w:r>
       <w:r>
         <w:t xml:space="preserve">kr, med ett intervall om </w:t>
       </w:r>
       <w:r>
-        <w:rPr>
-          <w:highlight w:val="yellow"/>
-        </w:rPr>
+        <w:rPr/>
         <w:t xml:space="preserve">± [belopp] </w:t>
       </w:r>
       <w:r>
@@ -476,23 +420,17 @@
         </w:rPr>
       </w:pPr>
       <w:r>
-        <w:rPr>
-          <w:highlight w:val="yellow"/>
-        </w:rPr>
+        <w:rPr/>
         <w:t>[Ort</w:t>
       </w:r>
       <w:proofErr w:type="gramStart"/>
       <w:r>
-        <w:rPr>
-          <w:highlight w:val="yellow"/>
-        </w:rPr>
+        <w:rPr/>
         <w:t>],[</w:t>
       </w:r>
       <w:proofErr w:type="gramEnd"/>
       <w:r>
-        <w:rPr>
-          <w:highlight w:val="yellow"/>
-        </w:rPr>
+        <w:rPr/>
         <w:t>Datum]</w:t>
       </w:r>
       <w:r>
@@ -513,22 +451,16 @@
         <w:br/>
       </w:r>
       <w:r>
-        <w:rPr>
-          <w:highlight w:val="yellow"/>
-        </w:rPr>
+        <w:rPr/>
         <w:t xml:space="preserve">[Mäklarens namn] </w:t>
       </w:r>
       <w:r>
-        <w:rPr>
-          <w:highlight w:val="yellow"/>
-        </w:rPr>
+        <w:rPr/>
         <w:br/>
         <w:t>[Titel/Funktion]</w:t>
       </w:r>
       <w:r>
-        <w:rPr>
-          <w:highlight w:val="yellow"/>
-        </w:rPr>
+        <w:rPr/>
         <w:br/>
         <w:t>[Företagets namn]</w:t>
       </w:r>

</xml_diff>

<commit_message>
Strip placeholder yellow highlights from Värdeutlåtande output (#9)
The mall.docx template marked every placeholder with a yellow highlight
as an authoring aid. python-docx writes the substituted text into the
paragraph's first run and preserves its formatting, so any field whose
first run carried the highlight rendered yellow in the populated docx.
The signing-date line (`[Ort],[Datum]`) was the only paragraph whose
first run was highlighted, which matches the operator's report.

Belt-and-suspenders: strip the highlights from every run in the bundled
template so future code paths inherit clean formatting, and strip the
highlight from the lead run after substitution in the populator so any
future hand-off template that ships placeholder highlights still renders
clean output.

Co-authored-by: theAspirant <the.aspirant.anonymous@gmail.com>
</commit_message>
<xml_diff>
--- a/app/valuation_statement/templates/vardeutlatande_mall.docx
+++ b/app/valuation_statement/templates/vardeutlatande_mall.docx
@@ -101,23 +101,17 @@
         <w:t>Objekt:</w:t>
       </w:r>
       <w:r>
-        <w:rPr>
-          <w:highlight w:val="yellow"/>
-        </w:rPr>
+        <w:rPr/>
         <w:t xml:space="preserve"> [Kommun Fastighet 1:1] [Lägenhetsnummer, BRF namn och </w:t>
       </w:r>
       <w:proofErr w:type="spellStart"/>
       <w:r>
-        <w:rPr>
-          <w:highlight w:val="yellow"/>
-        </w:rPr>
+        <w:rPr/>
         <w:t>orgnr</w:t>
       </w:r>
       <w:proofErr w:type="spellEnd"/>
       <w:r>
-        <w:rPr>
-          <w:highlight w:val="yellow"/>
-        </w:rPr>
+        <w:rPr/>
         <w:t>]</w:t>
       </w:r>
     </w:p>
@@ -140,21 +134,15 @@
         <w:t xml:space="preserve"> </w:t>
       </w:r>
       <w:r>
-        <w:rPr>
-          <w:highlight w:val="yellow"/>
-        </w:rPr>
+        <w:rPr/>
         <w:t xml:space="preserve">[Gatuadress, </w:t>
       </w:r>
       <w:r>
-        <w:rPr>
-          <w:highlight w:val="yellow"/>
-        </w:rPr>
+        <w:rPr/>
         <w:t>postort]</w:t>
       </w:r>
       <w:r>
-        <w:rPr>
-          <w:highlight w:val="yellow"/>
-        </w:rPr>
+        <w:rPr/>
         <w:t xml:space="preserve"> [Enbart bostadsrätt]</w:t>
       </w:r>
     </w:p>
@@ -177,15 +165,11 @@
         <w:t xml:space="preserve"> </w:t>
       </w:r>
       <w:r>
-        <w:rPr>
-          <w:highlight w:val="yellow"/>
-        </w:rPr>
+        <w:rPr/>
         <w:t>[Kommun]</w:t>
       </w:r>
       <w:r>
-        <w:rPr>
-          <w:highlight w:val="yellow"/>
-        </w:rPr>
+        <w:rPr/>
         <w:t xml:space="preserve"> [Enbart bostadsrätt]</w:t>
       </w:r>
     </w:p>
@@ -208,9 +192,7 @@
         <w:t xml:space="preserve"> </w:t>
       </w:r>
       <w:r>
-        <w:rPr>
-          <w:highlight w:val="yellow"/>
-        </w:rPr>
+        <w:rPr/>
         <w:t>[Friköpt / Tomträtt / Bostadsrätt]</w:t>
       </w:r>
     </w:p>
@@ -236,53 +218,39 @@
         <w:t xml:space="preserve"> </w:t>
       </w:r>
       <w:r>
-        <w:rPr>
-          <w:highlight w:val="yellow"/>
-        </w:rPr>
+        <w:rPr/>
         <w:t xml:space="preserve">per datum </w:t>
       </w:r>
       <w:proofErr w:type="spellStart"/>
       <w:r>
-        <w:rPr>
-          <w:highlight w:val="yellow"/>
-        </w:rPr>
+        <w:rPr/>
         <w:t>xxxx-xx-xx</w:t>
       </w:r>
       <w:proofErr w:type="spellEnd"/>
       <w:r>
-        <w:rPr>
-          <w:highlight w:val="yellow"/>
-        </w:rPr>
+        <w:rPr/>
         <w:t>,</w:t>
       </w:r>
       <w:r>
         <w:t xml:space="preserve"> fastighetsutdrag </w:t>
       </w:r>
       <w:r>
-        <w:rPr>
-          <w:highlight w:val="yellow"/>
-        </w:rPr>
+        <w:rPr/>
         <w:t xml:space="preserve">per datum </w:t>
       </w:r>
       <w:proofErr w:type="spellStart"/>
       <w:r>
-        <w:rPr>
-          <w:highlight w:val="yellow"/>
-        </w:rPr>
+        <w:rPr/>
         <w:t>xxxx-xx-</w:t>
       </w:r>
       <w:proofErr w:type="gramStart"/>
       <w:r>
-        <w:rPr>
-          <w:highlight w:val="yellow"/>
-        </w:rPr>
+        <w:rPr/>
         <w:t>xx</w:t>
       </w:r>
       <w:proofErr w:type="spellEnd"/>
       <w:r>
-        <w:rPr>
-          <w:highlight w:val="yellow"/>
-        </w:rPr>
+        <w:rPr/>
         <w:t>,</w:t>
       </w:r>
       <w:r>
@@ -299,16 +267,12 @@
         <w:t xml:space="preserve"> </w:t>
       </w:r>
       <w:r>
-        <w:rPr>
-          <w:highlight w:val="yellow"/>
-        </w:rPr>
+        <w:rPr/>
         <w:t xml:space="preserve">per datum </w:t>
       </w:r>
       <w:proofErr w:type="spellStart"/>
       <w:r>
-        <w:rPr>
-          <w:highlight w:val="yellow"/>
-        </w:rPr>
+        <w:rPr/>
         <w:t>xxxx-xx-xx</w:t>
       </w:r>
       <w:proofErr w:type="spellEnd"/>
@@ -325,15 +289,11 @@
         <w:t xml:space="preserve">g. </w:t>
       </w:r>
       <w:r>
-        <w:rPr>
-          <w:highlight w:val="yellow"/>
-        </w:rPr>
+        <w:rPr/>
         <w:t xml:space="preserve"> [Fyll på ifall bilder har inhämtats och bedömning ifall det föreligger renoveringsbehov eller</w:t>
       </w:r>
       <w:r>
-        <w:rPr>
-          <w:highlight w:val="yellow"/>
-        </w:rPr>
+        <w:rPr/>
         <w:t xml:space="preserve"> annat].</w:t>
       </w:r>
     </w:p>
@@ -369,18 +329,14 @@
         <w:t xml:space="preserve">Vid värdering av </w:t>
       </w:r>
       <w:r>
-        <w:rPr>
-          <w:highlight w:val="yellow"/>
-        </w:rPr>
+        <w:rPr/>
         <w:t>[objekt]</w:t>
       </w:r>
       <w:r>
         <w:t xml:space="preserve"> i </w:t>
       </w:r>
       <w:r>
-        <w:rPr>
-          <w:highlight w:val="yellow"/>
-        </w:rPr>
+        <w:rPr/>
         <w:t>[Kommun]</w:t>
       </w:r>
       <w:r>
@@ -411,32 +367,24 @@
         <w:t xml:space="preserve"> storlek, läge, standard och skick. Nyckeltal såsom genomsnittspris, pris per kvm och K/T värde används som stöd i bedömningen, tillsammans med värderarens erfarenhet och kunskap om den lokala marknaden. Marknadsförhållandena och likviditeten bedöms som </w:t>
       </w:r>
       <w:r>
-        <w:rPr>
-          <w:highlight w:val="yellow"/>
-        </w:rPr>
+        <w:rPr/>
         <w:t>[god/normal/låg].</w:t>
       </w:r>
       <w:r>
         <w:t xml:space="preserve"> </w:t>
       </w:r>
       <w:r>
-        <w:rPr>
-          <w:highlight w:val="yellow"/>
-        </w:rPr>
+        <w:rPr/>
         <w:t xml:space="preserve">Vid låg likviditet behöver vi en förklaring, </w:t>
       </w:r>
       <w:proofErr w:type="gramStart"/>
       <w:r>
-        <w:rPr>
-          <w:highlight w:val="yellow"/>
-        </w:rPr>
+        <w:rPr/>
         <w:t>t.ex.</w:t>
       </w:r>
       <w:proofErr w:type="gramEnd"/>
       <w:r>
-        <w:rPr>
-          <w:highlight w:val="yellow"/>
-        </w:rPr>
+        <w:rPr/>
         <w:t xml:space="preserve"> sålda objekt senaste 3/12 månader.</w:t>
       </w:r>
       <w:r>
@@ -450,18 +398,14 @@
         <w:t xml:space="preserve">Marknadsvärdet bedöms till </w:t>
       </w:r>
       <w:r>
-        <w:rPr>
-          <w:highlight w:val="yellow"/>
-        </w:rPr>
+        <w:rPr/>
         <w:t xml:space="preserve">[belopp] </w:t>
       </w:r>
       <w:r>
         <w:t xml:space="preserve">kr, med ett intervall om </w:t>
       </w:r>
       <w:r>
-        <w:rPr>
-          <w:highlight w:val="yellow"/>
-        </w:rPr>
+        <w:rPr/>
         <w:t xml:space="preserve">± [belopp] </w:t>
       </w:r>
       <w:r>
@@ -476,23 +420,17 @@
         </w:rPr>
       </w:pPr>
       <w:r>
-        <w:rPr>
-          <w:highlight w:val="yellow"/>
-        </w:rPr>
+        <w:rPr/>
         <w:t>[Ort</w:t>
       </w:r>
       <w:proofErr w:type="gramStart"/>
       <w:r>
-        <w:rPr>
-          <w:highlight w:val="yellow"/>
-        </w:rPr>
+        <w:rPr/>
         <w:t>],[</w:t>
       </w:r>
       <w:proofErr w:type="gramEnd"/>
       <w:r>
-        <w:rPr>
-          <w:highlight w:val="yellow"/>
-        </w:rPr>
+        <w:rPr/>
         <w:t>Datum]</w:t>
       </w:r>
       <w:r>
@@ -513,22 +451,16 @@
         <w:br/>
       </w:r>
       <w:r>
-        <w:rPr>
-          <w:highlight w:val="yellow"/>
-        </w:rPr>
+        <w:rPr/>
         <w:t xml:space="preserve">[Mäklarens namn] </w:t>
       </w:r>
       <w:r>
-        <w:rPr>
-          <w:highlight w:val="yellow"/>
-        </w:rPr>
+        <w:rPr/>
         <w:br/>
         <w:t>[Titel/Funktion]</w:t>
       </w:r>
       <w:r>
-        <w:rPr>
-          <w:highlight w:val="yellow"/>
-        </w:rPr>
+        <w:rPr/>
         <w:br/>
         <w:t>[Företagets namn]</w:t>
       </w:r>

</xml_diff>

<commit_message>
Un-bold Beskrivning label and add separator above
Two operator-feedback layout tweaks for the Värdeutlåtande output:

- mall.docx: strip the bold formatting from the lead 'Beskrivning:' run
  so the label renders as plain text alongside the rest of the
  paragraph (item 1 of system_3 #1124).
- mall.docx: insert an empty paragraph between the last Värderingsobjekt
  bullet (Upplåtelseform) and the Beskrivning paragraph so the
  description appears as its own clearly-separated block one step below
  the bullet list (item 2 of system_3 #1124).
- tests: add regressions for the un-bold lead run and for the empty
  paragraph separator preceding Beskrivning.
</commit_message>
<xml_diff>
--- a/app/valuation_statement/templates/vardeutlatande_mall.docx
+++ b/app/valuation_statement/templates/vardeutlatande_mall.docx
@@ -197,11 +197,12 @@
       <w:pPr>
         <w:spacing w:after="240"/>
       </w:pPr>
-      <w:r>
-        <w:rPr>
-          <w:b/>
-          <w:bCs/>
-        </w:rPr>
+    </w:p>
+    <w:p>
+      <w:pPr>
+        <w:spacing w:after="240"/>
+      </w:pPr>
+      <w:r>
         <w:t>Beskrivning:</w:t>
       </w:r>
       <w:r>

</xml_diff>

<commit_message>
Un-bold Beskrivning label and add separator above (#22)
Two operator-feedback layout tweaks for the Värdeutlåtande output:

- mall.docx: strip the bold formatting from the lead 'Beskrivning:' run
  so the label renders as plain text alongside the rest of the
  paragraph (item 1 of system_3 #1124).
- mall.docx: insert an empty paragraph between the last Värderingsobjekt
  bullet (Upplåtelseform) and the Beskrivning paragraph so the
  description appears as its own clearly-separated block one step below
  the bullet list (item 2 of system_3 #1124).
- tests: add regressions for the un-bold lead run and for the empty
  paragraph separator preceding Beskrivning.

Co-authored-by: theAspirant <the.aspirant.anonymous@gmail.com>
</commit_message>
<xml_diff>
--- a/app/valuation_statement/templates/vardeutlatande_mall.docx
+++ b/app/valuation_statement/templates/vardeutlatande_mall.docx
@@ -197,11 +197,12 @@
       <w:pPr>
         <w:spacing w:after="240"/>
       </w:pPr>
-      <w:r>
-        <w:rPr>
-          <w:b/>
-          <w:bCs/>
-        </w:rPr>
+    </w:p>
+    <w:p>
+      <w:pPr>
+        <w:spacing w:after="240"/>
+      </w:pPr>
+      <w:r>
         <w:t>Beskrivning:</w:t>
       </w:r>
       <w:r>

</xml_diff>